<commit_message>
data(reference): literature-referenced datasets (>=3 per assay) + provenance/results
Adds reference_datasets/ with 3 datasets per module in upload-template format,
generated and analysed by build_and_run.py. Survival sample 1 = real Freireich 1963
raw data; circadian sample 1 = real Konopka-Benzer 1971 periods (24/19/28 h); the rest
are simulated from text-verified published parameters (each cited in PROVENANCE.md).
All 18 datasets reproduce the published expectation (RESULTS.md). Documented as
Supplementary Note S2.

Co-Authored-By: Claude Opus 4.8 <noreply@anthropic.com>
</commit_message>
<xml_diff>
--- a/manuscript/DroPhenix_supplementary.docx
+++ b/manuscript/DroPhenix_supplementary.docx
@@ -4525,6 +4525,171 @@
         <w:t xml:space="preserve"> and is well-calibrated (coverage ≈ nominal), confirming it is the efficient, correct estimator under unequal N (Figure 2).</w:t>
       </w:r>
     </w:p>
+    <w:p>
+      <w:pPr>
+        <w:pStyle w:val="Heading1"/>
+      </w:pPr>
+      <w:r>
+        <w:t>Supplementary Note S2. Literature-referenced reference datasets (≥3 per assay)</w:t>
+      </w:r>
+    </w:p>
+    <w:p>
+      <w:pPr>
+        <w:spacing w:line="480" w:lineRule="auto" w:after="120"/>
+        <w:jc w:val="both"/>
+      </w:pPr>
+      <w:r>
+        <w:t>To exercise every module on data tied to the literature, the repository ships</w:t>
+      </w:r>
+    </w:p>
+    <w:p>
+      <w:pPr>
+        <w:spacing w:line="480" w:lineRule="auto" w:after="120"/>
+        <w:jc w:val="both"/>
+      </w:pPr>
+      <w:r>
+        <w:rPr>
+          <w:rFonts w:ascii="Consolas" w:hAnsi="Consolas"/>
+          <w:sz w:val="19"/>
+        </w:rPr>
+        <w:t>reference_datasets/</w:t>
+      </w:r>
+      <w:r>
+        <w:t xml:space="preserve"> with three datasets per assay, in each module's upload-template</w:t>
+      </w:r>
+    </w:p>
+    <w:p>
+      <w:pPr>
+        <w:spacing w:line="480" w:lineRule="auto" w:after="120"/>
+        <w:jc w:val="both"/>
+      </w:pPr>
+      <w:r>
+        <w:t xml:space="preserve">format, generated and analysed by </w:t>
+      </w:r>
+      <w:r>
+        <w:rPr>
+          <w:rFonts w:ascii="Consolas" w:hAnsi="Consolas"/>
+          <w:sz w:val="19"/>
+        </w:rPr>
+        <w:t>reference_datasets/build_and_run.py</w:t>
+      </w:r>
+      <w:r>
+        <w:t xml:space="preserve"> (provenance in</w:t>
+      </w:r>
+    </w:p>
+    <w:p>
+      <w:pPr>
+        <w:spacing w:line="480" w:lineRule="auto" w:after="120"/>
+        <w:jc w:val="both"/>
+      </w:pPr>
+      <w:r>
+        <w:rPr>
+          <w:rFonts w:ascii="Consolas" w:hAnsi="Consolas"/>
+          <w:sz w:val="19"/>
+        </w:rPr>
+        <w:t>reference_datasets/PROVENANCE.md</w:t>
+      </w:r>
+      <w:r>
+        <w:t xml:space="preserve">, results in </w:t>
+      </w:r>
+      <w:r>
+        <w:rPr>
+          <w:rFonts w:ascii="Consolas" w:hAnsi="Consolas"/>
+          <w:sz w:val="19"/>
+        </w:rPr>
+        <w:t>reference_datasets/RESULTS.md</w:t>
+      </w:r>
+      <w:r>
+        <w:t>). Survival</w:t>
+      </w:r>
+    </w:p>
+    <w:p>
+      <w:pPr>
+        <w:spacing w:line="480" w:lineRule="auto" w:after="120"/>
+        <w:jc w:val="both"/>
+      </w:pPr>
+      <w:r>
+        <w:t xml:space="preserve">sample 1 is the </w:t>
+      </w:r>
+      <w:r>
+        <w:rPr>
+          <w:b/>
+        </w:rPr>
+        <w:t>real</w:t>
+      </w:r>
+      <w:r>
+        <w:t xml:space="preserve"> Freireich et al. (1963) raw 6-MP data; circadian sample 1 uses the</w:t>
+      </w:r>
+    </w:p>
+    <w:p>
+      <w:pPr>
+        <w:spacing w:line="480" w:lineRule="auto" w:after="120"/>
+        <w:jc w:val="both"/>
+      </w:pPr>
+      <w:r>
+        <w:rPr>
+          <w:b/>
+        </w:rPr>
+        <w:t>real</w:t>
+      </w:r>
+      <w:r>
+        <w:t xml:space="preserve"> Konopka &amp; Benzer (1971) free-running periods (24/19/28 h). The remaining datasets</w:t>
+      </w:r>
+    </w:p>
+    <w:p>
+      <w:pPr>
+        <w:spacing w:line="480" w:lineRule="auto" w:after="120"/>
+        <w:jc w:val="both"/>
+      </w:pPr>
+      <w:r>
+        <w:t>are simulated from text-verified published parameters (alternation chance 50%, Lewis 2017;</w:t>
+      </w:r>
+    </w:p>
+    <w:p>
+      <w:pPr>
+        <w:spacing w:line="480" w:lineRule="auto" w:after="120"/>
+        <w:jc w:val="both"/>
+      </w:pPr>
+      <w:r>
+        <w:t>turn-bias mean 0.50 and 23.5% extreme, Buchanan/de Bivort 2015; wild-type lifespan median</w:t>
+      </w:r>
+    </w:p>
+    <w:p>
+      <w:pPr>
+        <w:spacing w:line="480" w:lineRule="auto" w:after="120"/>
+        <w:jc w:val="both"/>
+      </w:pPr>
+      <w:r>
+        <w:t>≈50 d, Linford 2013; larval speed ≈1 mm s⁻¹; grooming ≈13% of time, Qiao 2018), each cited</w:t>
+      </w:r>
+    </w:p>
+    <w:p>
+      <w:pPr>
+        <w:spacing w:line="480" w:lineRule="auto" w:after="120"/>
+        <w:jc w:val="both"/>
+      </w:pPr>
+      <w:r>
+        <w:t>in PROVENANCE.md and clearly labelled as simulated (machine-readable raw supplements were</w:t>
+      </w:r>
+    </w:p>
+    <w:p>
+      <w:pPr>
+        <w:spacing w:line="480" w:lineRule="auto" w:after="120"/>
+        <w:jc w:val="both"/>
+      </w:pPr>
+      <w:r>
+        <w:t>not retrievable for those assays). **All 18 datasets reproduce the cited published</w:t>
+      </w:r>
+    </w:p>
+    <w:p>
+      <w:pPr>
+        <w:spacing w:line="480" w:lineRule="auto" w:after="120"/>
+        <w:jc w:val="both"/>
+      </w:pPr>
+      <w:r>
+        <w:t>expectation** when run through DroPhenix.</w:t>
+      </w:r>
+    </w:p>
     <w:sectPr>
       <w:pgSz w:w="12240" w:h="15840"/>
       <w:pgMar w:top="1440" w:right="1440" w:bottom="1440" w:left="1440" w:header="720" w:footer="720" w:gutter="0"/>

</xml_diff>

<commit_message>
style+suppl: v3 sidebar/footer, remove emoji, add Supplementary Figures S1-S6 + formulas
App style: sidebar and footer now read v3.0 (was v2.0); removed all emoji/glyphs
(download-arrow, home-card icons) per journal/style guidance — no technical/module
changes. Reference datasets: Treatment "NA" -> "Untreated" (NA parsed as NaN and
dropped grooming groups). Supplementary: add per-module analysis-result Figures
S1-S6 (Okabe-Ito, 300 dpi) via make_supplementary_figures.py, plus figure legends
and a formula-summary appendix; rebuild both Word docs (main: 2 tables/3 figs;
supplementary: 5 tables/6 figs), schema-valid.

Co-Authored-By: Claude Opus 4.8 <noreply@anthropic.com>
</commit_message>
<xml_diff>
--- a/manuscript/DroPhenix_supplementary.docx
+++ b/manuscript/DroPhenix_supplementary.docx
@@ -4690,6 +4690,868 @@
         <w:t>expectation** when run through DroPhenix.</w:t>
       </w:r>
     </w:p>
+    <w:p>
+      <w:pPr>
+        <w:pStyle w:val="Heading1"/>
+      </w:pPr>
+      <w:r>
+        <w:t>Supplementary Figures</w:t>
+      </w:r>
+    </w:p>
+    <w:p>
+      <w:pPr>
+        <w:spacing w:line="480" w:lineRule="auto" w:after="120"/>
+        <w:jc w:val="both"/>
+      </w:pPr>
+      <w:r>
+        <w:t>Analysis results produced live by the DroPhenix modules on the literature-referenced reference datasets (Supplementary Note S2). Colour-blind-safe (Okabe-Ito) palette; single Arial font.</w:t>
+      </w:r>
+    </w:p>
+    <w:p>
+      <w:pPr>
+        <w:spacing w:after="120"/>
+      </w:pPr>
+      <w:r>
+        <w:rPr>
+          <w:b/>
+        </w:rPr>
+        <w:t>Figure S1. Climbing (negative geotaxis).</w:t>
+      </w:r>
+      <w:r>
+        <w:t xml:space="preserve"> Endpoint Performance Index (PI = 2·%climbed − 100) by group for three disease-model datasets (PD α-synuclein, ALS TDP-43, HD polyQ). In every dataset wild-type PI exceeds the disease-model vehicle and the drug partially rescues.</w:t>
+      </w:r>
+    </w:p>
+    <w:p>
+      <w:pPr>
+        <w:jc w:val="center"/>
+      </w:pPr>
+      <w:r>
+        <w:drawing>
+          <wp:inline xmlns:a="http://schemas.openxmlformats.org/drawingml/2006/main" xmlns:pic="http://schemas.openxmlformats.org/drawingml/2006/picture">
+            <wp:extent cx="5760720" cy="1947528"/>
+            <wp:docPr id="1" name="Picture 1"/>
+            <wp:cNvGraphicFramePr>
+              <a:graphicFrameLocks noChangeAspect="1"/>
+            </wp:cNvGraphicFramePr>
+            <a:graphic>
+              <a:graphicData uri="http://schemas.openxmlformats.org/drawingml/2006/picture">
+                <pic:pic>
+                  <pic:nvPicPr>
+                    <pic:cNvPr id="0" name="FigureS1_climbing.png"/>
+                    <pic:cNvPicPr/>
+                  </pic:nvPicPr>
+                  <pic:blipFill>
+                    <a:blip r:embed="rId9"/>
+                    <a:stretch>
+                      <a:fillRect/>
+                    </a:stretch>
+                  </pic:blipFill>
+                  <pic:spPr>
+                    <a:xfrm>
+                      <a:off x="0" y="0"/>
+                      <a:ext cx="5760720" cy="1947528"/>
+                    </a:xfrm>
+                    <a:prstGeom prst="rect"/>
+                  </pic:spPr>
+                </pic:pic>
+              </a:graphicData>
+            </a:graphic>
+          </wp:inline>
+        </w:drawing>
+      </w:r>
+    </w:p>
+    <w:p>
+      <w:pPr>
+        <w:spacing w:after="120"/>
+      </w:pPr>
+      <w:r>
+        <w:rPr>
+          <w:b/>
+        </w:rPr>
+        <w:t>Figure S2. Lifespan.</w:t>
+      </w:r>
+      <w:r>
+        <w:t xml:space="preserve"> Kaplan–Meier survival curves; sample 1 is the real Freireich et al. (1963) 6-MP trial (median 23 vs 8 weeks), samples 2–3 are Gompertz fly cohorts (wild-type median ≈50 d; disease shorter; drug extends).</w:t>
+      </w:r>
+    </w:p>
+    <w:p>
+      <w:pPr>
+        <w:jc w:val="center"/>
+      </w:pPr>
+      <w:r>
+        <w:drawing>
+          <wp:inline xmlns:a="http://schemas.openxmlformats.org/drawingml/2006/main" xmlns:pic="http://schemas.openxmlformats.org/drawingml/2006/picture">
+            <wp:extent cx="5760720" cy="1948986"/>
+            <wp:docPr id="2" name="Picture 2"/>
+            <wp:cNvGraphicFramePr>
+              <a:graphicFrameLocks noChangeAspect="1"/>
+            </wp:cNvGraphicFramePr>
+            <a:graphic>
+              <a:graphicData uri="http://schemas.openxmlformats.org/drawingml/2006/picture">
+                <pic:pic>
+                  <pic:nvPicPr>
+                    <pic:cNvPr id="0" name="FigureS2_survival.png"/>
+                    <pic:cNvPicPr/>
+                  </pic:nvPicPr>
+                  <pic:blipFill>
+                    <a:blip r:embed="rId10"/>
+                    <a:stretch>
+                      <a:fillRect/>
+                    </a:stretch>
+                  </pic:blipFill>
+                  <pic:spPr>
+                    <a:xfrm>
+                      <a:off x="0" y="0"/>
+                      <a:ext cx="5760720" cy="1948986"/>
+                    </a:xfrm>
+                    <a:prstGeom prst="rect"/>
+                  </pic:spPr>
+                </pic:pic>
+              </a:graphicData>
+            </a:graphic>
+          </wp:inline>
+        </w:drawing>
+      </w:r>
+    </w:p>
+    <w:p>
+      <w:pPr>
+        <w:spacing w:after="120"/>
+      </w:pPr>
+      <w:r>
+        <w:rPr>
+          <w:b/>
+        </w:rPr>
+        <w:t>Figure S3. Y-maze.</w:t>
+      </w:r>
+      <w:r>
+        <w:t xml:space="preserve"> Mean spontaneous alternation (± SEM) per genotype against the 50% chance line (Lewis 2017); wild-type alternates above chance and above the memory-mutant cohorts.</w:t>
+      </w:r>
+    </w:p>
+    <w:p>
+      <w:pPr>
+        <w:jc w:val="center"/>
+      </w:pPr>
+      <w:r>
+        <w:drawing>
+          <wp:inline xmlns:a="http://schemas.openxmlformats.org/drawingml/2006/main" xmlns:pic="http://schemas.openxmlformats.org/drawingml/2006/picture">
+            <wp:extent cx="5760720" cy="1947528"/>
+            <wp:docPr id="3" name="Picture 3"/>
+            <wp:cNvGraphicFramePr>
+              <a:graphicFrameLocks noChangeAspect="1"/>
+            </wp:cNvGraphicFramePr>
+            <a:graphic>
+              <a:graphicData uri="http://schemas.openxmlformats.org/drawingml/2006/picture">
+                <pic:pic>
+                  <pic:nvPicPr>
+                    <pic:cNvPr id="0" name="FigureS3_ymaze.png"/>
+                    <pic:cNvPicPr/>
+                  </pic:nvPicPr>
+                  <pic:blipFill>
+                    <a:blip r:embed="rId11"/>
+                    <a:stretch>
+                      <a:fillRect/>
+                    </a:stretch>
+                  </pic:blipFill>
+                  <pic:spPr>
+                    <a:xfrm>
+                      <a:off x="0" y="0"/>
+                      <a:ext cx="5760720" cy="1947528"/>
+                    </a:xfrm>
+                    <a:prstGeom prst="rect"/>
+                  </pic:spPr>
+                </pic:pic>
+              </a:graphicData>
+            </a:graphic>
+          </wp:inline>
+        </w:drawing>
+      </w:r>
+    </w:p>
+    <w:p>
+      <w:pPr>
+        <w:spacing w:after="120"/>
+      </w:pPr>
+      <w:r>
+        <w:rPr>
+          <w:b/>
+        </w:rPr>
+        <w:t>Figure S4. DAMS circadian period.</w:t>
+      </w:r>
+      <w:r>
+        <w:t xml:space="preserve"> Chi-square (Sokolove–Bushell) periodograms for wild-type, per-short and per-long, recovering the Konopka &amp; Benzer (1971) periods of 24, 19 and 28 h respectively; dashed line = Bonferroni-corrected significance threshold.</w:t>
+      </w:r>
+    </w:p>
+    <w:p>
+      <w:pPr>
+        <w:jc w:val="center"/>
+      </w:pPr>
+      <w:r>
+        <w:drawing>
+          <wp:inline xmlns:a="http://schemas.openxmlformats.org/drawingml/2006/main" xmlns:pic="http://schemas.openxmlformats.org/drawingml/2006/picture">
+            <wp:extent cx="5760720" cy="1938346"/>
+            <wp:docPr id="4" name="Picture 4"/>
+            <wp:cNvGraphicFramePr>
+              <a:graphicFrameLocks noChangeAspect="1"/>
+            </wp:cNvGraphicFramePr>
+            <a:graphic>
+              <a:graphicData uri="http://schemas.openxmlformats.org/drawingml/2006/picture">
+                <pic:pic>
+                  <pic:nvPicPr>
+                    <pic:cNvPr id="0" name="FigureS4_dams.png"/>
+                    <pic:cNvPicPr/>
+                  </pic:nvPicPr>
+                  <pic:blipFill>
+                    <a:blip r:embed="rId12"/>
+                    <a:stretch>
+                      <a:fillRect/>
+                    </a:stretch>
+                  </pic:blipFill>
+                  <pic:spPr>
+                    <a:xfrm>
+                      <a:off x="0" y="0"/>
+                      <a:ext cx="5760720" cy="1938346"/>
+                    </a:xfrm>
+                    <a:prstGeom prst="rect"/>
+                  </pic:spPr>
+                </pic:pic>
+              </a:graphicData>
+            </a:graphic>
+          </wp:inline>
+        </w:drawing>
+      </w:r>
+    </w:p>
+    <w:p>
+      <w:pPr>
+        <w:spacing w:after="120"/>
+      </w:pPr>
+      <w:r>
+        <w:rPr>
+          <w:b/>
+        </w:rPr>
+        <w:t>Figure S5. Larval crawling.</w:t>
+      </w:r>
+      <w:r>
+        <w:t xml:space="preserve"> Mean crawling speed (± SEM) by genotype for three disease contrasts; wild-type ≈1 mm s⁻¹, disease models slower, drug partially restored.</w:t>
+      </w:r>
+    </w:p>
+    <w:p>
+      <w:pPr>
+        <w:jc w:val="center"/>
+      </w:pPr>
+      <w:r>
+        <w:drawing>
+          <wp:inline xmlns:a="http://schemas.openxmlformats.org/drawingml/2006/main" xmlns:pic="http://schemas.openxmlformats.org/drawingml/2006/picture">
+            <wp:extent cx="5760720" cy="1947528"/>
+            <wp:docPr id="5" name="Picture 5"/>
+            <wp:cNvGraphicFramePr>
+              <a:graphicFrameLocks noChangeAspect="1"/>
+            </wp:cNvGraphicFramePr>
+            <a:graphic>
+              <a:graphicData uri="http://schemas.openxmlformats.org/drawingml/2006/picture">
+                <pic:pic>
+                  <pic:nvPicPr>
+                    <pic:cNvPr id="0" name="FigureS5_larval.png"/>
+                    <pic:cNvPicPr/>
+                  </pic:nvPicPr>
+                  <pic:blipFill>
+                    <a:blip r:embed="rId13"/>
+                    <a:stretch>
+                      <a:fillRect/>
+                    </a:stretch>
+                  </pic:blipFill>
+                  <pic:spPr>
+                    <a:xfrm>
+                      <a:off x="0" y="0"/>
+                      <a:ext cx="5760720" cy="1947528"/>
+                    </a:xfrm>
+                    <a:prstGeom prst="rect"/>
+                  </pic:spPr>
+                </pic:pic>
+              </a:graphicData>
+            </a:graphic>
+          </wp:inline>
+        </w:drawing>
+      </w:r>
+    </w:p>
+    <w:p>
+      <w:pPr>
+        <w:spacing w:after="120"/>
+      </w:pPr>
+      <w:r>
+        <w:rPr>
+          <w:b/>
+        </w:rPr>
+        <w:t>Figure S6. Grooming.</w:t>
+      </w:r>
+      <w:r>
+        <w:t xml:space="preserve"> Percentage of time grooming (± SEM) by genotype; wild-type ≈13% (Qiao 2018), reduced in the disease models and partially restored by drug.</w:t>
+      </w:r>
+    </w:p>
+    <w:p>
+      <w:pPr>
+        <w:jc w:val="center"/>
+      </w:pPr>
+      <w:r>
+        <w:drawing>
+          <wp:inline xmlns:a="http://schemas.openxmlformats.org/drawingml/2006/main" xmlns:pic="http://schemas.openxmlformats.org/drawingml/2006/picture">
+            <wp:extent cx="5760720" cy="1947528"/>
+            <wp:docPr id="6" name="Picture 6"/>
+            <wp:cNvGraphicFramePr>
+              <a:graphicFrameLocks noChangeAspect="1"/>
+            </wp:cNvGraphicFramePr>
+            <a:graphic>
+              <a:graphicData uri="http://schemas.openxmlformats.org/drawingml/2006/picture">
+                <pic:pic>
+                  <pic:nvPicPr>
+                    <pic:cNvPr id="0" name="FigureS6_grooming.png"/>
+                    <pic:cNvPicPr/>
+                  </pic:nvPicPr>
+                  <pic:blipFill>
+                    <a:blip r:embed="rId14"/>
+                    <a:stretch>
+                      <a:fillRect/>
+                    </a:stretch>
+                  </pic:blipFill>
+                  <pic:spPr>
+                    <a:xfrm>
+                      <a:off x="0" y="0"/>
+                      <a:ext cx="5760720" cy="1947528"/>
+                    </a:xfrm>
+                    <a:prstGeom prst="rect"/>
+                  </pic:spPr>
+                </pic:pic>
+              </a:graphicData>
+            </a:graphic>
+          </wp:inline>
+        </w:drawing>
+      </w:r>
+    </w:p>
+    <w:p>
+      <w:pPr>
+        <w:pStyle w:val="Heading1"/>
+      </w:pPr>
+      <w:r>
+        <w:t>Supplementary Methods: formula summary</w:t>
+      </w:r>
+    </w:p>
+    <w:tbl>
+      <w:tblPr>
+        <w:tblStyle w:val="LightGrid-Accent1"/>
+        <w:tblW w:type="auto" w:w="0"/>
+        <w:jc w:val="center"/>
+        <w:tblLook w:firstColumn="1" w:firstRow="1" w:lastColumn="0" w:lastRow="0" w:noHBand="0" w:noVBand="1" w:val="04A0"/>
+      </w:tblPr>
+      <w:tblGrid>
+        <w:gridCol w:w="4680"/>
+        <w:gridCol w:w="4680"/>
+      </w:tblGrid>
+      <w:tr>
+        <w:tc>
+          <w:tcPr>
+            <w:tcW w:type="dxa" w:w="4680"/>
+          </w:tcPr>
+          <w:p>
+            <w:pPr>
+              <w:spacing w:after="20" w:line="240" w:lineRule="auto"/>
+            </w:pPr>
+            <w:r>
+              <w:rPr>
+                <w:rFonts w:ascii="Arial" w:hAnsi="Arial"/>
+                <w:b/>
+                <w:sz w:val="17"/>
+              </w:rPr>
+              <w:t>Quantity</w:t>
+            </w:r>
+          </w:p>
+        </w:tc>
+        <w:tc>
+          <w:tcPr>
+            <w:tcW w:type="dxa" w:w="4680"/>
+          </w:tcPr>
+          <w:p>
+            <w:pPr>
+              <w:spacing w:after="20" w:line="240" w:lineRule="auto"/>
+            </w:pPr>
+            <w:r>
+              <w:rPr>
+                <w:rFonts w:ascii="Arial" w:hAnsi="Arial"/>
+                <w:b/>
+                <w:sz w:val="17"/>
+              </w:rPr>
+              <w:t>Formula</w:t>
+            </w:r>
+          </w:p>
+        </w:tc>
+      </w:tr>
+      <w:tr>
+        <w:tc>
+          <w:tcPr>
+            <w:tcW w:type="dxa" w:w="4680"/>
+          </w:tcPr>
+          <w:p>
+            <w:pPr>
+              <w:spacing w:after="20" w:line="240" w:lineRule="auto"/>
+            </w:pPr>
+            <w:r>
+              <w:rPr>
+                <w:rFonts w:ascii="Arial" w:hAnsi="Arial"/>
+                <w:sz w:val="17"/>
+              </w:rPr>
+              <w:t>Performance Index</w:t>
+            </w:r>
+          </w:p>
+        </w:tc>
+        <w:tc>
+          <w:tcPr>
+            <w:tcW w:type="dxa" w:w="4680"/>
+          </w:tcPr>
+          <w:p>
+            <w:pPr>
+              <w:spacing w:after="20" w:line="240" w:lineRule="auto"/>
+            </w:pPr>
+            <w:r>
+              <w:rPr>
+                <w:rFonts w:ascii="Arial" w:hAnsi="Arial"/>
+                <w:sz w:val="17"/>
+              </w:rPr>
+              <w:t>PI = 2·(climbed/total)·100 − 100</w:t>
+            </w:r>
+          </w:p>
+        </w:tc>
+      </w:tr>
+      <w:tr>
+        <w:tc>
+          <w:tcPr>
+            <w:tcW w:type="dxa" w:w="4680"/>
+          </w:tcPr>
+          <w:p>
+            <w:pPr>
+              <w:spacing w:after="20" w:line="240" w:lineRule="auto"/>
+            </w:pPr>
+            <w:r>
+              <w:rPr>
+                <w:rFonts w:ascii="Arial" w:hAnsi="Arial"/>
+                <w:sz w:val="17"/>
+              </w:rPr>
+              <w:t>Kaplan–Meier</w:t>
+            </w:r>
+          </w:p>
+        </w:tc>
+        <w:tc>
+          <w:tcPr>
+            <w:tcW w:type="dxa" w:w="4680"/>
+          </w:tcPr>
+          <w:p>
+            <w:pPr>
+              <w:spacing w:after="20" w:line="240" w:lineRule="auto"/>
+            </w:pPr>
+            <w:r>
+              <w:rPr>
+                <w:rFonts w:ascii="Arial" w:hAnsi="Arial"/>
+                <w:sz w:val="17"/>
+              </w:rPr>
+              <w:t>Ŝ(t) = Π_{tᵢ≤t}(1 − dᵢ/nᵢ); Greenwood Var = Ŝ(t)²·Σ dᵢ/[nᵢ(nᵢ−dᵢ)]</w:t>
+            </w:r>
+          </w:p>
+        </w:tc>
+      </w:tr>
+      <w:tr>
+        <w:tc>
+          <w:tcPr>
+            <w:tcW w:type="dxa" w:w="4680"/>
+          </w:tcPr>
+          <w:p>
+            <w:pPr>
+              <w:spacing w:after="20" w:line="240" w:lineRule="auto"/>
+            </w:pPr>
+            <w:r>
+              <w:rPr>
+                <w:rFonts w:ascii="Arial" w:hAnsi="Arial"/>
+                <w:sz w:val="17"/>
+              </w:rPr>
+              <w:t>Log-rank (Mantel–Cox)</w:t>
+            </w:r>
+          </w:p>
+        </w:tc>
+        <w:tc>
+          <w:tcPr>
+            <w:tcW w:type="dxa" w:w="4680"/>
+          </w:tcPr>
+          <w:p>
+            <w:pPr>
+              <w:spacing w:after="20" w:line="240" w:lineRule="auto"/>
+            </w:pPr>
+            <w:r>
+              <w:rPr>
+                <w:rFonts w:ascii="Arial" w:hAnsi="Arial"/>
+                <w:sz w:val="17"/>
+              </w:rPr>
+              <w:t>χ² = (Σ(O₁ⱼ − E₁ⱼ))² / Σ V₁ⱼ; df = G−1</w:t>
+            </w:r>
+          </w:p>
+        </w:tc>
+      </w:tr>
+      <w:tr>
+        <w:tc>
+          <w:tcPr>
+            <w:tcW w:type="dxa" w:w="4680"/>
+          </w:tcPr>
+          <w:p>
+            <w:pPr>
+              <w:spacing w:after="20" w:line="240" w:lineRule="auto"/>
+            </w:pPr>
+            <w:r>
+              <w:rPr>
+                <w:rFonts w:ascii="Arial" w:hAnsi="Arial"/>
+                <w:sz w:val="17"/>
+              </w:rPr>
+              <w:t>Cox PH</w:t>
+            </w:r>
+          </w:p>
+        </w:tc>
+        <w:tc>
+          <w:tcPr>
+            <w:tcW w:type="dxa" w:w="4680"/>
+          </w:tcPr>
+          <w:p>
+            <w:pPr>
+              <w:spacing w:after="20" w:line="240" w:lineRule="auto"/>
+            </w:pPr>
+            <w:r>
+              <w:rPr>
+                <w:rFonts w:ascii="Arial" w:hAnsi="Arial"/>
+                <w:sz w:val="17"/>
+              </w:rPr>
+              <w:t>h(t\</w:t>
+            </w:r>
+          </w:p>
+        </w:tc>
+      </w:tr>
+      <w:tr>
+        <w:tc>
+          <w:tcPr>
+            <w:tcW w:type="dxa" w:w="4680"/>
+          </w:tcPr>
+          <w:p>
+            <w:pPr>
+              <w:spacing w:after="20" w:line="240" w:lineRule="auto"/>
+            </w:pPr>
+            <w:r>
+              <w:rPr>
+                <w:rFonts w:ascii="Arial" w:hAnsi="Arial"/>
+                <w:sz w:val="17"/>
+              </w:rPr>
+              <w:t>χ² periodogram</w:t>
+            </w:r>
+          </w:p>
+        </w:tc>
+        <w:tc>
+          <w:tcPr>
+            <w:tcW w:type="dxa" w:w="4680"/>
+          </w:tcPr>
+          <w:p>
+            <w:pPr>
+              <w:spacing w:after="20" w:line="240" w:lineRule="auto"/>
+            </w:pPr>
+            <w:r>
+              <w:rPr>
+                <w:rFonts w:ascii="Arial" w:hAnsi="Arial"/>
+                <w:sz w:val="17"/>
+              </w:rPr>
+              <w:t>Q_P = N′·K·Σ_h(X̄_h−X̄)² / Σ(Xᵢ−X̄)² ~ χ²_{p−1}; Bonferroni across periods</w:t>
+            </w:r>
+          </w:p>
+        </w:tc>
+      </w:tr>
+      <w:tr>
+        <w:tc>
+          <w:tcPr>
+            <w:tcW w:type="dxa" w:w="4680"/>
+          </w:tcPr>
+          <w:p>
+            <w:pPr>
+              <w:spacing w:after="20" w:line="240" w:lineRule="auto"/>
+            </w:pPr>
+            <w:r>
+              <w:rPr>
+                <w:rFonts w:ascii="Arial" w:hAnsi="Arial"/>
+                <w:sz w:val="17"/>
+              </w:rPr>
+              <w:t>Sleep</w:t>
+            </w:r>
+          </w:p>
+        </w:tc>
+        <w:tc>
+          <w:tcPr>
+            <w:tcW w:type="dxa" w:w="4680"/>
+          </w:tcPr>
+          <w:p>
+            <w:pPr>
+              <w:spacing w:after="20" w:line="240" w:lineRule="auto"/>
+            </w:pPr>
+            <w:r>
+              <w:rPr>
+                <w:rFonts w:ascii="Arial" w:hAnsi="Arial"/>
+                <w:sz w:val="17"/>
+              </w:rPr>
+              <w:t>bout = ≥5 consecutive min of zero activity</w:t>
+            </w:r>
+          </w:p>
+        </w:tc>
+      </w:tr>
+      <w:tr>
+        <w:tc>
+          <w:tcPr>
+            <w:tcW w:type="dxa" w:w="4680"/>
+          </w:tcPr>
+          <w:p>
+            <w:pPr>
+              <w:spacing w:after="20" w:line="240" w:lineRule="auto"/>
+            </w:pPr>
+            <w:r>
+              <w:rPr>
+                <w:rFonts w:ascii="Arial" w:hAnsi="Arial"/>
+                <w:sz w:val="17"/>
+              </w:rPr>
+              <w:t>Spontaneous alternation</w:t>
+            </w:r>
+          </w:p>
+        </w:tc>
+        <w:tc>
+          <w:tcPr>
+            <w:tcW w:type="dxa" w:w="4680"/>
+          </w:tcPr>
+          <w:p>
+            <w:pPr>
+              <w:spacing w:after="20" w:line="240" w:lineRule="auto"/>
+            </w:pPr>
+            <w:r>
+              <w:rPr>
+                <w:rFonts w:ascii="Arial" w:hAnsi="Arial"/>
+                <w:sz w:val="17"/>
+              </w:rPr>
+              <w:t>%alt = 100·(alternation triads)/(entries−2); chance = 50%</w:t>
+            </w:r>
+          </w:p>
+        </w:tc>
+      </w:tr>
+      <w:tr>
+        <w:tc>
+          <w:tcPr>
+            <w:tcW w:type="dxa" w:w="4680"/>
+          </w:tcPr>
+          <w:p>
+            <w:pPr>
+              <w:spacing w:after="20" w:line="240" w:lineRule="auto"/>
+            </w:pPr>
+            <w:r>
+              <w:rPr>
+                <w:rFonts w:ascii="Arial" w:hAnsi="Arial"/>
+                <w:sz w:val="17"/>
+              </w:rPr>
+              <w:t>Turn bias</w:t>
+            </w:r>
+          </w:p>
+        </w:tc>
+        <w:tc>
+          <w:tcPr>
+            <w:tcW w:type="dxa" w:w="4680"/>
+          </w:tcPr>
+          <w:p>
+            <w:pPr>
+              <w:spacing w:after="20" w:line="240" w:lineRule="auto"/>
+            </w:pPr>
+            <w:r>
+              <w:rPr>
+                <w:rFonts w:ascii="Arial" w:hAnsi="Arial"/>
+                <w:sz w:val="17"/>
+              </w:rPr>
+              <w:t>b = R/(R+L); individuality: observed MAD vs binomial-null MAD</w:t>
+            </w:r>
+          </w:p>
+        </w:tc>
+      </w:tr>
+      <w:tr>
+        <w:tc>
+          <w:tcPr>
+            <w:tcW w:type="dxa" w:w="4680"/>
+          </w:tcPr>
+          <w:p>
+            <w:pPr>
+              <w:spacing w:after="20" w:line="240" w:lineRule="auto"/>
+            </w:pPr>
+            <w:r>
+              <w:rPr>
+                <w:rFonts w:ascii="Arial" w:hAnsi="Arial"/>
+                <w:sz w:val="17"/>
+              </w:rPr>
+              <w:t>Motor Decline Rate</w:t>
+            </w:r>
+          </w:p>
+        </w:tc>
+        <w:tc>
+          <w:tcPr>
+            <w:tcW w:type="dxa" w:w="4680"/>
+          </w:tcPr>
+          <w:p>
+            <w:pPr>
+              <w:spacing w:after="20" w:line="240" w:lineRule="auto"/>
+            </w:pPr>
+            <w:r>
+              <w:rPr>
+                <w:rFonts w:ascii="Arial" w:hAnsi="Arial"/>
+                <w:sz w:val="17"/>
+              </w:rPr>
+              <w:t>PI(age) = PI₀·e^(−k·age); Δk = k_vehicle − k_drug</w:t>
+            </w:r>
+          </w:p>
+        </w:tc>
+      </w:tr>
+      <w:tr>
+        <w:tc>
+          <w:tcPr>
+            <w:tcW w:type="dxa" w:w="4680"/>
+          </w:tcPr>
+          <w:p>
+            <w:pPr>
+              <w:spacing w:after="20" w:line="240" w:lineRule="auto"/>
+            </w:pPr>
+            <w:r>
+              <w:rPr>
+                <w:rFonts w:ascii="Arial" w:hAnsi="Arial"/>
+                <w:sz w:val="17"/>
+              </w:rPr>
+              <w:t>Hedges' g</w:t>
+            </w:r>
+          </w:p>
+        </w:tc>
+        <w:tc>
+          <w:tcPr>
+            <w:tcW w:type="dxa" w:w="4680"/>
+          </w:tcPr>
+          <w:p>
+            <w:pPr>
+              <w:spacing w:after="20" w:line="240" w:lineRule="auto"/>
+            </w:pPr>
+            <w:r>
+              <w:rPr>
+                <w:rFonts w:ascii="Arial" w:hAnsi="Arial"/>
+                <w:sz w:val="17"/>
+              </w:rPr>
+              <w:t>g = J·(x̄_t−x̄_c)/s_p, J = 1 − 3/[4(n₁+n₂)−9]</w:t>
+            </w:r>
+          </w:p>
+        </w:tc>
+      </w:tr>
+      <w:tr>
+        <w:tc>
+          <w:tcPr>
+            <w:tcW w:type="dxa" w:w="4680"/>
+          </w:tcPr>
+          <w:p>
+            <w:pPr>
+              <w:spacing w:after="20" w:line="240" w:lineRule="auto"/>
+            </w:pPr>
+            <w:r>
+              <w:rPr>
+                <w:rFonts w:ascii="Arial" w:hAnsi="Arial"/>
+                <w:sz w:val="17"/>
+              </w:rPr>
+              <w:t>Var(g)</w:t>
+            </w:r>
+          </w:p>
+        </w:tc>
+        <w:tc>
+          <w:tcPr>
+            <w:tcW w:type="dxa" w:w="4680"/>
+          </w:tcPr>
+          <w:p>
+            <w:pPr>
+              <w:spacing w:after="20" w:line="240" w:lineRule="auto"/>
+            </w:pPr>
+            <w:r>
+              <w:rPr>
+                <w:rFonts w:ascii="Arial" w:hAnsi="Arial"/>
+                <w:sz w:val="17"/>
+              </w:rPr>
+              <w:t>J²·[(n₁+n₂)/(n₁n₂) + g²/(2(n₁+n₂−2))]</w:t>
+            </w:r>
+          </w:p>
+        </w:tc>
+      </w:tr>
+      <w:tr>
+        <w:tc>
+          <w:tcPr>
+            <w:tcW w:type="dxa" w:w="4680"/>
+          </w:tcPr>
+          <w:p>
+            <w:pPr>
+              <w:spacing w:after="20" w:line="240" w:lineRule="auto"/>
+            </w:pPr>
+            <w:r>
+              <w:rPr>
+                <w:rFonts w:ascii="Arial" w:hAnsi="Arial"/>
+                <w:sz w:val="17"/>
+              </w:rPr>
+              <w:t>Inverse-variance pooling</w:t>
+            </w:r>
+          </w:p>
+        </w:tc>
+        <w:tc>
+          <w:tcPr>
+            <w:tcW w:type="dxa" w:w="4680"/>
+          </w:tcPr>
+          <w:p>
+            <w:pPr>
+              <w:spacing w:after="20" w:line="240" w:lineRule="auto"/>
+            </w:pPr>
+            <w:r>
+              <w:rPr>
+                <w:rFonts w:ascii="Arial" w:hAnsi="Arial"/>
+                <w:sz w:val="17"/>
+              </w:rPr>
+              <w:t>g_pooled = Σwᵢgᵢ/Σwᵢ, wᵢ = 1/Var(gᵢ), Var = 1/Σwᵢ</w:t>
+            </w:r>
+          </w:p>
+        </w:tc>
+      </w:tr>
+      <w:tr>
+        <w:tc>
+          <w:tcPr>
+            <w:tcW w:type="dxa" w:w="4680"/>
+          </w:tcPr>
+          <w:p>
+            <w:pPr>
+              <w:spacing w:after="20" w:line="240" w:lineRule="auto"/>
+            </w:pPr>
+            <w:r>
+              <w:rPr>
+                <w:rFonts w:ascii="Arial" w:hAnsi="Arial"/>
+                <w:sz w:val="17"/>
+              </w:rPr>
+              <w:t>DerSimonian–Laird</w:t>
+            </w:r>
+          </w:p>
+        </w:tc>
+        <w:tc>
+          <w:tcPr>
+            <w:tcW w:type="dxa" w:w="4680"/>
+          </w:tcPr>
+          <w:p>
+            <w:pPr>
+              <w:spacing w:after="20" w:line="240" w:lineRule="auto"/>
+            </w:pPr>
+            <w:r>
+              <w:rPr>
+                <w:rFonts w:ascii="Arial" w:hAnsi="Arial"/>
+                <w:sz w:val="17"/>
+              </w:rPr>
+              <w:t>τ² = max(0,(Q−(k−1))/C); wᵢ* = 1/(Var(gᵢ)+τ²); I² = max(0,(Q−(k−1))/Q)</w:t>
+            </w:r>
+          </w:p>
+        </w:tc>
+      </w:tr>
+    </w:tbl>
+    <w:p/>
     <w:sectPr>
       <w:pgSz w:w="12240" w:h="15840"/>
       <w:pgMar w:top="1440" w:right="1440" w:bottom="1440" w:left="1440" w:header="720" w:footer="720" w:gutter="0"/>

</xml_diff>